<commit_message>
day_03 remove unuse files
</commit_message>
<xml_diff>
--- a/day_3/bookstore-online-gio4/DuongHungThinh_23733531.docx
+++ b/day_3/bookstore-online-gio4/DuongHungThinh_23733531.docx
@@ -22,40 +22,22 @@
         <w:r>
           <w:rPr>
             <w:rStyle w:val="Hyperlink"/>
-            <w:rFonts w:ascii="Times New Roman" w:hAnsi="Times New Roman" w:cs="Times New Roman"/>
-            <w:sz w:val="26"/>
-            <w:szCs w:val="26"/>
           </w:rPr>
-          <w:t>https://github.com/hthinh24/IUH-mobile-react-native/</w:t>
+          <w:t>https://github.com/hthin</w:t>
         </w:r>
         <w:r>
           <w:rPr>
             <w:rStyle w:val="Hyperlink"/>
-            <w:rFonts w:ascii="Times New Roman" w:hAnsi="Times New Roman" w:cs="Times New Roman"/>
-            <w:sz w:val="26"/>
-            <w:szCs w:val="26"/>
           </w:rPr>
-          <w:t>t</w:t>
+          <w:t>h</w:t>
         </w:r>
         <w:r>
           <w:rPr>
             <w:rStyle w:val="Hyperlink"/>
-            <w:rFonts w:ascii="Times New Roman" w:hAnsi="Times New Roman" w:cs="Times New Roman"/>
-            <w:sz w:val="26"/>
-            <w:szCs w:val="26"/>
           </w:rPr>
-          <w:t>ree/main/day_3</w:t>
+          <w:t>24/IUH-mobile-react-native/tree/main/day_3/bookstore-online-gio4</w:t>
         </w:r>
       </w:hyperlink>
-    </w:p>
-    <w:p>
-      <w:pPr>
-        <w:rPr>
-          <w:rFonts w:ascii="Times New Roman" w:hAnsi="Times New Roman" w:cs="Times New Roman"/>
-          <w:sz w:val="26"/>
-          <w:szCs w:val="26"/>
-        </w:rPr>
-      </w:pPr>
     </w:p>
     <w:p>
       <w:pPr>

</xml_diff>